<commit_message>
The actual final commit
Updated documentation formatting and added an extra set of documentation files for old program examples.

Hope it all goes well!
</commit_message>
<xml_diff>
--- a/Docs/DocumentationFile.docx
+++ b/Docs/DocumentationFile.docx
@@ -3927,12 +3927,15 @@
         <w:t>High degrees of player customisation and personal decision applications, allowing for individuality in progression and expression.</w:t>
       </w:r>
     </w:p>
+    <w:p/>
+    <w:p/>
     <w:p>
       <w:pPr>
         <w:pStyle w:val="Heading3"/>
       </w:pPr>
       <w:bookmarkStart w:id="7" w:name="_Toc202446570"/>
       <w:r>
+        <w:lastRenderedPageBreak/>
         <w:t>Nonfunctional Proposed Components</w:t>
       </w:r>
       <w:bookmarkEnd w:id="7"/>
@@ -3988,7 +3991,6 @@
         </w:numPr>
       </w:pPr>
       <w:r>
-        <w:lastRenderedPageBreak/>
         <w:t>Player character customization systems, such as adjusting the object of use, changing colours, or even different textures and patterns, that are similarly saved to the player’s file</w:t>
       </w:r>
     </w:p>
@@ -4207,12 +4209,17 @@
         <w:t>CPU and a minimum of two gigabytes of RAM.</w:t>
       </w:r>
     </w:p>
+    <w:p/>
+    <w:p/>
+    <w:p/>
+    <w:p/>
     <w:p>
       <w:pPr>
         <w:pStyle w:val="Heading2"/>
       </w:pPr>
       <w:bookmarkStart w:id="10" w:name="_Toc202446573"/>
       <w:r>
+        <w:lastRenderedPageBreak/>
         <w:t>Method / Approach</w:t>
       </w:r>
       <w:bookmarkEnd w:id="10"/>
@@ -4238,158 +4245,158 @@
     </w:p>
     <w:p>
       <w:r>
+        <w:t xml:space="preserve">Designing the project itself will be especially documented, including references to my inspiration and potential avenues for further development should time allow for it. Designing the project will happen multiple times throughout the project but </w:t>
+      </w:r>
+      <w:r>
+        <w:t>many of</w:t>
+      </w:r>
+      <w:r>
+        <w:t xml:space="preserve"> my own considerations will be developed at the beginning, </w:t>
+      </w:r>
+      <w:r>
+        <w:t>preceding</w:t>
+      </w:r>
+      <w:r>
+        <w:t xml:space="preserve"> any proper development of the systems. Later design activities will be more focused on individual features based on user feedback, as well as my own availability and workload overall.</w:t>
+      </w:r>
+    </w:p>
+    <w:p>
+      <w:r>
+        <w:t xml:space="preserve">Implementation of designed features will be conducted first with attempts at various components of the engine I assigned, in order to determine the capabilities </w:t>
+      </w:r>
+      <w:r>
+        <w:t xml:space="preserve">to be </w:t>
+      </w:r>
+      <w:r>
+        <w:t>address</w:t>
+      </w:r>
+      <w:r>
+        <w:t>ed</w:t>
+      </w:r>
+      <w:r>
+        <w:t xml:space="preserve"> within the project itself, without relying too heavily on needing a finished product. Later development progress will be through the collective of systems I have designed, and in a significantly more structured format that utilizes important OOP principles</w:t>
+      </w:r>
+      <w:r>
+        <w:t>, especially that of Inheritance and Polymorphism in order to optimise and improve the functionality of the game itself.</w:t>
+      </w:r>
+    </w:p>
+    <w:p>
+      <w:r>
+        <w:t>Testing and implementation/development components will be repeatedly occurring over the process of ‘sprints’, being individually set ranges of the timeline in which that is the primary focus of the development of the project. Testing systems will involve not only the isolation and confirmation of different critical components, but also testing the entire program as a whole and confirming my findings with short Q/A tests by ‘hired’ helpers who have experience in game design or gameplay systems.</w:t>
+      </w:r>
+    </w:p>
+    <w:p>
+      <w:r>
+        <w:t>Maintenance and mock launches will also be included as repeating cycles at the end of development sprints and during testing phases through tests of packaging and release systems (e.g. how the system handle</w:t>
+      </w:r>
+      <w:r>
+        <w:t>s</w:t>
+      </w:r>
+      <w:r>
+        <w:t xml:space="preserve"> conversion to an .exe file for release), as well as further functionality tests from both </w:t>
+      </w:r>
+      <w:r>
+        <w:t>me</w:t>
+      </w:r>
+      <w:r>
+        <w:t xml:space="preserve"> and any in-person test</w:t>
+      </w:r>
+      <w:r>
+        <w:t>er</w:t>
+      </w:r>
+      <w:r>
+        <w:t>s I find. I especially insist upon finding other people to help test, as despite my own qualifications for gameplay testing, different people will have different ideas for different situations, and my own experience in developing the game has the potential to cloud my own ability to notice flaws.</w:t>
+      </w:r>
+    </w:p>
+    <w:p/>
+    <w:p/>
+    <w:p/>
+    <w:p>
+      <w:pPr>
+        <w:pStyle w:val="Heading2"/>
+      </w:pPr>
+      <w:bookmarkStart w:id="11" w:name="_Toc202446574"/>
+      <w:r>
         <w:lastRenderedPageBreak/>
-        <w:t xml:space="preserve">Designing the project itself will be especially documented, including references to my inspiration and potential avenues for further development should time allow for it. Designing the project will happen multiple times throughout the project but </w:t>
-      </w:r>
-      <w:r>
-        <w:t>many of</w:t>
-      </w:r>
-      <w:r>
-        <w:t xml:space="preserve"> my own considerations will be developed at the beginning, </w:t>
-      </w:r>
-      <w:r>
-        <w:t>preceding</w:t>
-      </w:r>
-      <w:r>
-        <w:t xml:space="preserve"> any proper development of the systems. Later design activities will be more focused on individual features based on user feedback, as well as my own availability and workload overall.</w:t>
-      </w:r>
-    </w:p>
-    <w:p>
-      <w:r>
-        <w:t xml:space="preserve">Implementation of designed features will be conducted first with attempts at various components of the engine I assigned, in order to determine the capabilities </w:t>
-      </w:r>
-      <w:r>
-        <w:t xml:space="preserve">to be </w:t>
-      </w:r>
-      <w:r>
-        <w:t>address</w:t>
-      </w:r>
-      <w:r>
-        <w:t>ed</w:t>
-      </w:r>
-      <w:r>
-        <w:t xml:space="preserve"> within the project itself, without relying too heavily on needing a finished product. Later development progress will be through the collective of systems I have designed, and in a significantly more structured format that utilizes important OOP principles</w:t>
-      </w:r>
-      <w:r>
-        <w:t>, especially that of Inheritance and Polymorphism in order to optimise and improve the functionality of the game itself.</w:t>
-      </w:r>
-    </w:p>
-    <w:p>
-      <w:r>
-        <w:t>Testing and implementation/development components will be repeatedly occurring over the process of ‘sprints’, being individually set ranges of the timeline in which that is the primary focus of the development of the project. Testing systems will involve not only the isolation and confirmation of different critical components, but also testing the entire program as a whole and confirming my findings with short Q/A tests by ‘hired’ helpers who have experience in game design or gameplay systems.</w:t>
-      </w:r>
-    </w:p>
-    <w:p>
-      <w:r>
-        <w:t>Maintenance and mock launches will also be included as repeating cycles at the end of development sprints and during testing phases through tests of packaging and release systems (e.g. how the system handle</w:t>
-      </w:r>
-      <w:r>
-        <w:t>s</w:t>
-      </w:r>
-      <w:r>
-        <w:t xml:space="preserve"> conversion to an .exe file for release), as well as further functionality tests from both </w:t>
-      </w:r>
-      <w:r>
-        <w:t>me</w:t>
-      </w:r>
-      <w:r>
-        <w:t xml:space="preserve"> and any in-person test</w:t>
-      </w:r>
-      <w:r>
-        <w:t>er</w:t>
-      </w:r>
-      <w:r>
-        <w:t>s I find. I especially insist upon finding other people to help test, as despite my own qualifications for gameplay testing, different people will have different ideas for different situations, and my own experience in developing the game has the potential to cloud my own ability to notice flaws.</w:t>
-      </w:r>
-    </w:p>
+        <w:t>Major Anticipated Challenges</w:t>
+      </w:r>
+      <w:bookmarkEnd w:id="11"/>
+    </w:p>
+    <w:p>
+      <w:r>
+        <w:t>The primary expected difficulties of this project are expected to arise in</w:t>
+      </w:r>
+      <w:r>
+        <w:t xml:space="preserve"> three</w:t>
+      </w:r>
+      <w:r>
+        <w:t xml:space="preserve"> specific areas</w:t>
+      </w:r>
+      <w:r>
+        <w:t>, as detailed below. My understanding of these points was defined by a series of rapid tests and early programming sprints designed as part of my feasibility study into the capabilities of the software systems I was planning on testing.</w:t>
+      </w:r>
+    </w:p>
+    <w:p>
+      <w:r>
+        <w:t>Firstly, the progression of my knowledge within the 3D medium thus requires me to understand the Ursina systems on a deep level in order to execute my level of customisation to the program. From basic testing since starting the writing process of this project proposal, it has already been found that I must design my own movement and collision for the player character, rather than using a preset system, as a result of my more complicated movement and camera mechanisms. Sorting the finer details of this system, especially in collision interactions between the models I plan on importing, will be a significant difficulty, and managing the creation of my own system of mesh interactions for complex models will be a difficult process.</w:t>
+      </w:r>
+    </w:p>
+    <w:p>
+      <w:r>
+        <w:t>The second expected challenge for this project lies in the music system. My plans for the creation and integration of music are heavily based on the original Geometry dash’s systems, where music is synchronized to certain actions and jumps within each of the levels. In this area, it becomes rather difficult to have my own version of this, as I cannot simply create an in-game framework due to the logistical limitations of my own time, the 3d medium, and the Ursina engine. Thus, I need to utilise the modelling software I was considering (blender</w:t>
+      </w:r>
+      <w:r>
+        <w:t>) and</w:t>
+      </w:r>
+      <w:r>
+        <w:t xml:space="preserve"> systematically consider where the player w</w:t>
+      </w:r>
+      <w:r>
+        <w:t>ill</w:t>
+      </w:r>
+      <w:r>
+        <w:t xml:space="preserve"> be at certain points in the song and link it to the progression of the level during construction.</w:t>
+      </w:r>
+    </w:p>
+    <w:p>
+      <w:r>
+        <w:t xml:space="preserve">The third challenge I will no doubt find within this project is the adoption of a variety of new mediums outside of my normal areas. In previous projects, I was primarily focused on 2D games or assistive </w:t>
+      </w:r>
+      <w:r>
+        <w:t>software</w:t>
+      </w:r>
+      <w:r>
+        <w:t xml:space="preserve">, so I have extremely limited experience within the 3D medium, aside from my previous experience with Blender software and modelling. Furthermore, I have almost zero experience in making music using computer-based </w:t>
+      </w:r>
+      <w:r>
+        <w:t>technology and</w:t>
+      </w:r>
+      <w:r>
+        <w:t xml:space="preserve"> will thereby need to teach myself the systems in order to design my own music to work with the levels (as I </w:t>
+      </w:r>
+      <w:r>
+        <w:t xml:space="preserve">will ensure the minimum usage of </w:t>
+      </w:r>
+      <w:r>
+        <w:t xml:space="preserve">free/stolen asset use). </w:t>
+      </w:r>
+    </w:p>
+    <w:p>
+      <w:r>
+        <w:t>Within all of these issues remains the core problem of learning and understanding the intricacies behind the newer mediums I am pursuing. Resolving these issues and maintaining my personal mental state through these challenges will require, above all, proper time management and personal restraint to avoid constantly following new ideas and getting wrapped up in unreasonably intricate detailing. Rapid prototyping and testing will be extremely helpful as well, enabling me to quickly explore multiple ideas and understand their feasibility over the longer time period of the term</w:t>
+      </w:r>
+      <w:r>
+        <w:t>.</w:t>
+      </w:r>
+    </w:p>
+    <w:p/>
     <w:p>
       <w:pPr>
         <w:pStyle w:val="Heading2"/>
       </w:pPr>
-      <w:bookmarkStart w:id="11" w:name="_Toc202446574"/>
-      <w:r>
-        <w:t>Major Anticipated Challenges</w:t>
-      </w:r>
-      <w:bookmarkEnd w:id="11"/>
-    </w:p>
-    <w:p>
-      <w:r>
-        <w:t>The primary expected difficulties of this project are expected to arise in</w:t>
-      </w:r>
-      <w:r>
-        <w:t xml:space="preserve"> three</w:t>
-      </w:r>
-      <w:r>
-        <w:t xml:space="preserve"> specific areas</w:t>
-      </w:r>
-      <w:r>
-        <w:t>, as detailed below. My understanding of these points was defined by a series of rapid tests and early programming sprints designed as part of my feasibility study into the capabilities of the software systems I was planning on testing.</w:t>
-      </w:r>
-    </w:p>
-    <w:p>
-      <w:r>
-        <w:t>Firstly, the progression of my knowledge within the 3D medium thus requires me to understand the Ursina systems on a deep level in order to execute my level of customisation to the program. From basic testing since starting the writing process of this project proposal, it has already been found that I must design my own movement and collision for the player character, rather than using a preset system, as a result of my more complicated movement and camera mechanisms. Sorting the finer details of this system, especially in collision interactions between the models I plan on importing, will be a significant difficulty, and managing the creation of my own system of mesh interactions for complex models will be a difficult process.</w:t>
-      </w:r>
-    </w:p>
-    <w:p>
-      <w:r>
-        <w:t xml:space="preserve">The second expected challenge for this project lies in the music system. My plans for the creation and integration of music are heavily based on the original Geometry dash’s systems, where music is synchronized to certain actions and jumps within each of the levels. In this area, it becomes rather difficult to have my own version of this, as I cannot simply create an in-game framework due to the logistical limitations of my own time, the 3d medium, and the Ursina </w:t>
-      </w:r>
+      <w:bookmarkStart w:id="12" w:name="_Toc202446575"/>
       <w:r>
         <w:lastRenderedPageBreak/>
-        <w:t>engine. Thus, I need to utilise the modelling software I was considering (blender</w:t>
-      </w:r>
-      <w:r>
-        <w:t>) and</w:t>
-      </w:r>
-      <w:r>
-        <w:t xml:space="preserve"> systematically consider where the player w</w:t>
-      </w:r>
-      <w:r>
-        <w:t>ill</w:t>
-      </w:r>
-      <w:r>
-        <w:t xml:space="preserve"> be at certain points in the song and link it to the progression of the level during construction.</w:t>
-      </w:r>
-    </w:p>
-    <w:p>
-      <w:r>
-        <w:t xml:space="preserve">The third challenge I will no doubt find within this project is the adoption of a variety of new mediums outside of my normal areas. In previous projects, I was primarily focused on 2D games or assistive </w:t>
-      </w:r>
-      <w:r>
-        <w:t>software</w:t>
-      </w:r>
-      <w:r>
-        <w:t xml:space="preserve">, so I have extremely limited experience within the 3D medium, aside from my previous experience with Blender software and modelling. Furthermore, I have almost zero experience in making music using computer-based </w:t>
-      </w:r>
-      <w:r>
-        <w:t>technology and</w:t>
-      </w:r>
-      <w:r>
-        <w:t xml:space="preserve"> will thereby need to teach myself the systems in order to design my own music to work with the levels (as I </w:t>
-      </w:r>
-      <w:r>
-        <w:t xml:space="preserve">will ensure the minimum usage of </w:t>
-      </w:r>
-      <w:r>
-        <w:t xml:space="preserve">free/stolen asset use). </w:t>
-      </w:r>
-    </w:p>
-    <w:p>
-      <w:r>
-        <w:t>Within all of these issues remains the core problem of learning and understanding the intricacies behind the newer mediums I am pursuing. Resolving these issues and maintaining my personal mental state through these challenges will require, above all, proper time management and personal restraint to avoid constantly following new ideas and getting wrapped up in unreasonably intricate detailing. Rapid prototyping and testing will be extremely helpful as well, enabling me to quickly explore multiple ideas and understand their feasibility over the longer time period of the term</w:t>
-      </w:r>
-      <w:r>
-        <w:t>.</w:t>
-      </w:r>
-    </w:p>
-    <w:p/>
-    <w:p>
-      <w:pPr>
-        <w:pStyle w:val="Heading2"/>
-      </w:pPr>
-      <w:bookmarkStart w:id="12" w:name="_Toc202446575"/>
-      <w:r>
         <w:t>Project Timeline Overview</w:t>
       </w:r>
       <w:bookmarkEnd w:id="12"/>
@@ -4635,6 +4642,16 @@
         </w:r>
       </w:hyperlink>
     </w:p>
+    <w:p/>
+    <w:p/>
+    <w:p/>
+    <w:p/>
+    <w:p/>
+    <w:p/>
+    <w:p/>
+    <w:p/>
+    <w:p/>
+    <w:p/>
     <w:p>
       <w:pPr>
         <w:pStyle w:val="Heading1"/>
@@ -4646,7 +4663,6 @@
       </w:r>
       <w:bookmarkEnd w:id="13"/>
     </w:p>
-    <w:p/>
     <w:p>
       <w:pPr>
         <w:pStyle w:val="Heading2"/>
@@ -4743,6 +4759,7 @@
     <w:p/>
     <w:p/>
     <w:p/>
+    <w:p/>
     <w:p>
       <w:pPr>
         <w:pStyle w:val="Heading2"/>
@@ -4881,7 +4898,7 @@
         </w:rPr>
         <w:lastRenderedPageBreak/>
         <w:drawing>
-          <wp:inline distT="0" distB="0" distL="0" distR="0" wp14:anchorId="6928F75E" wp14:editId="6128D402">
+          <wp:inline distT="0" distB="0" distL="0" distR="0" wp14:anchorId="6928F75E" wp14:editId="01D0886C">
             <wp:extent cx="5731510" cy="1937385"/>
             <wp:effectExtent l="0" t="0" r="2540" b="5715"/>
             <wp:docPr id="776575711" name="Picture 6" descr="A diagram of a diagram&#10;&#10;AI-generated content may be incorrect."/>
@@ -7283,6 +7300,7 @@
         <w:t>extra visual effects, as well as extra options such as the Wardrobe menu are less important to the game itself as the system can function without them, however they provide extra visual polish and player customisability that enables improved player enjoyment.</w:t>
       </w:r>
     </w:p>
+    <w:p/>
     <w:p>
       <w:pPr>
         <w:pStyle w:val="Heading2"/>
@@ -7390,11 +7408,8 @@
     </w:p>
     <w:p>
       <w:r>
-        <w:t xml:space="preserve">Load testing also provided significant improvements to the program, namely in an understanding of how much of a system impact the program created. Using the discrepancy in </w:t>
-      </w:r>
-      <w:r>
         <w:lastRenderedPageBreak/>
-        <w:t>processing power between my laptops and pc, I was able to test the device on multiple systems and with varying levels of processing power; from higher-end 32gb ram devices with high-functioning CPUs to midrange, consumer-level 8gb ram on a work computer, to even smaller loads using virtual machines to simulate as low as 4gb of total system ram and a CPU from 2012. This provided a highly accurate metric data to allow me to understand the main problem areas of the program through Ursina’s entity and fps display, ensuring I could target problem areas for improvement, ultimately leading to the development of the ‘potato mode’ – effective for lower end devices in alleviating harder tasks and disabling heavy animations - and utilising various rendering tactics to improve the load efficiency of the game’s processes.</w:t>
+        <w:t>Load testing also provided significant improvements to the program, namely in an understanding of how much of a system impact the program created. Using the discrepancy in processing power between my laptops and pc, I was able to test the device on multiple systems and with varying levels of processing power; from higher-end 32gb ram devices with high-functioning CPUs to midrange, consumer-level 8gb ram on a work computer, to even smaller loads using virtual machines to simulate as low as 4gb of total system ram and a CPU from 2012. This provided a highly accurate metric data to allow me to understand the main problem areas of the program through Ursina’s entity and fps display, ensuring I could target problem areas for improvement, ultimately leading to the development of the ‘potato mode’ – effective for lower end devices in alleviating harder tasks and disabling heavy animations - and utilising various rendering tactics to improve the load efficiency of the game’s processes.</w:t>
       </w:r>
     </w:p>
     <w:p/>
@@ -7555,7 +7570,11 @@
           </w:tcPr>
           <w:p>
             <w:r>
-              <w:t>Importing blender models as substitutes for native rendered Ursina objects; applying textures based on different files to understand rendering system better.</w:t>
+              <w:t xml:space="preserve">Importing blender models as substitutes for native rendered Ursina objects; applying textures based on different files </w:t>
+            </w:r>
+            <w:r>
+              <w:lastRenderedPageBreak/>
+              <w:t>to understand rendering system better.</w:t>
             </w:r>
           </w:p>
         </w:tc>
@@ -7565,7 +7584,12 @@
           </w:tcPr>
           <w:p>
             <w:r>
-              <w:t xml:space="preserve">Object should import similar or identically to the modelled donut and have the assigned texture from the export .mtl file referenced in the .obj file export. </w:t>
+              <w:lastRenderedPageBreak/>
+              <w:t xml:space="preserve">Object should import similar or identically to the modelled donut and have the assigned texture from the export .mtl file referenced in </w:t>
+            </w:r>
+            <w:r>
+              <w:lastRenderedPageBreak/>
+              <w:t xml:space="preserve">the .obj file export. </w:t>
             </w:r>
           </w:p>
         </w:tc>
@@ -7575,11 +7599,12 @@
           </w:tcPr>
           <w:p>
             <w:r>
-              <w:t xml:space="preserve">Donut object renders properly and assigns textures as requested. However, the incredibly high polygon count of the model reduces the rendering speed of the game </w:t>
-            </w:r>
-            <w:r>
               <w:lastRenderedPageBreak/>
-              <w:t>down to &gt;10fps, resulting in massive frame drops and errors</w:t>
+              <w:t xml:space="preserve">Donut object renders properly and assigns textures as requested. However, the incredibly high polygon count of the model </w:t>
+            </w:r>
+            <w:r>
+              <w:lastRenderedPageBreak/>
+              <w:t>reduces the rendering speed of the game down to &gt;10fps, resulting in massive frame drops and errors</w:t>
             </w:r>
           </w:p>
         </w:tc>
@@ -7596,7 +7621,11 @@
           <w:p/>
           <w:p>
             <w:r>
-              <w:t>This test reveals significantly more about the processing power of my own computer and Ursina’s base handling of large-poly objects.</w:t>
+              <w:t xml:space="preserve">This test reveals significantly more about the processing power of my own computer and Ursina’s </w:t>
+            </w:r>
+            <w:r>
+              <w:lastRenderedPageBreak/>
+              <w:t>base handling of large-poly objects.</w:t>
             </w:r>
           </w:p>
         </w:tc>
@@ -7882,7 +7911,11 @@
           </w:tcPr>
           <w:p>
             <w:r>
-              <w:t>Player falls directly through the map components and fully through the playable area. Hitboxes reveal an oddly arranged map hitbox that seems adjusted in an odd way; this hitbox seems to be unable to be edited or moved</w:t>
+              <w:t xml:space="preserve">Player falls directly through the map components and fully through the playable area. Hitboxes reveal an oddly arranged map hitbox that seems adjusted in an odd way; this hitbox seems to be </w:t>
+            </w:r>
+            <w:r>
+              <w:lastRenderedPageBreak/>
+              <w:t>unable to be edited or moved</w:t>
             </w:r>
           </w:p>
         </w:tc>
@@ -7892,6 +7925,7 @@
           </w:tcPr>
           <w:p>
             <w:r>
+              <w:lastRenderedPageBreak/>
               <w:t>Fail</w:t>
             </w:r>
           </w:p>
@@ -7904,7 +7938,6 @@
           </w:tcPr>
           <w:p>
             <w:r>
-              <w:lastRenderedPageBreak/>
               <w:t>TC04-Collision</w:t>
             </w:r>
           </w:p>
@@ -9288,23 +9321,21 @@
         <w:t>[Sam] “I’ll take that into account, thank you. And I’ll be sure to let you know when I need your help next.”</w:t>
       </w:r>
     </w:p>
+    <w:p/>
     <w:p>
       <w:pPr>
         <w:pStyle w:val="Heading2"/>
       </w:pPr>
       <w:bookmarkStart w:id="35" w:name="_Toc202446598"/>
       <w:r>
+        <w:lastRenderedPageBreak/>
         <w:t>Evaluation Against Requirements</w:t>
       </w:r>
       <w:bookmarkEnd w:id="35"/>
     </w:p>
     <w:p>
       <w:r>
-        <w:t xml:space="preserve">My own requirements for the game were based on the functional and nonfunctional requirements listed in the project proposal. Thus, I combined my ideas from the functional and </w:t>
-      </w:r>
-      <w:r>
-        <w:lastRenderedPageBreak/>
-        <w:t>nonfunctional requirements in addition to my internal definitions for a ‘proper’ game in the Development Process, leading to a list of components for the game and their conceptual design necessities.</w:t>
+        <w:t>My own requirements for the game were based on the functional and nonfunctional requirements listed in the project proposal. Thus, I combined my ideas from the functional and nonfunctional requirements in addition to my internal definitions for a ‘proper’ game in the Development Process, leading to a list of components for the game and their conceptual design necessities.</w:t>
       </w:r>
     </w:p>
     <w:p>
@@ -9405,11 +9436,8 @@
     </w:p>
     <w:p>
       <w:r>
-        <w:t xml:space="preserve">The visual aesthetics of the game are generally effective but limited in their graphical fidelity by my need to provide a low-specification requirement and the effective limitations of the Ursina engine. My best explanation of this is in the simple animation ability of the game, with nearly no </w:t>
-      </w:r>
-      <w:r>
         <w:lastRenderedPageBreak/>
-        <w:t>posing controls, a limited movement control within the python IDE and an inability to import prerendered object animations from software such as blender, instead requiring a constant object replacement to simulate animation via the equivalent of a flipbook animation with .obj files.</w:t>
+        <w:t>The visual aesthetics of the game are generally effective but limited in their graphical fidelity by my need to provide a low-specification requirement and the effective limitations of the Ursina engine. My best explanation of this is in the simple animation ability of the game, with nearly no posing controls, a limited movement control within the python IDE and an inability to import prerendered object animations from software such as blender, instead requiring a constant object replacement to simulate animation via the equivalent of a flipbook animation with .obj files.</w:t>
       </w:r>
     </w:p>
     <w:p>
@@ -9479,253 +9507,248 @@
       </w:pPr>
       <w:bookmarkStart w:id="36" w:name="_Toc202446599"/>
       <w:r>
+        <w:lastRenderedPageBreak/>
         <w:t>Improvements and Future Work</w:t>
       </w:r>
       <w:bookmarkEnd w:id="36"/>
     </w:p>
     <w:p>
       <w:r>
-        <w:t xml:space="preserve">While the game itself is in a theoretically ‘complete’ state as per my functional and nonfunctional requirements, as well as player experience criteria, components of the game </w:t>
+        <w:t>While the game itself is in a theoretically ‘complete’ state as per my functional and nonfunctional requirements, as well as player experience criteria, components of the game itself had to be trimmed, cut or entirely scrapped as a result of the experienced limitations of time, knowledge, and choice of tools.</w:t>
+      </w:r>
+    </w:p>
+    <w:p>
+      <w:r>
+        <w:t xml:space="preserve">The most important component I would consider if I had the capability to take extra time and improve the game is to entirely scrap my usage of the Ursina engine. While it was helpful to apply my own capabilities in designing and building the game and </w:t>
+      </w:r>
+      <w:r>
+        <w:t>its</w:t>
+      </w:r>
+      <w:r>
+        <w:t xml:space="preserve"> mechanics in the more familiar environment of python, Ursina itself is highly limiting and frankly terrible at </w:t>
+      </w:r>
+      <w:r>
+        <w:t>its</w:t>
+      </w:r>
+      <w:r>
+        <w:t xml:space="preserve"> singular purpose of 3D rendering. </w:t>
+      </w:r>
+      <w:r>
+        <w:t>Its</w:t>
+      </w:r>
+      <w:r>
+        <w:t xml:space="preserve"> graphical libraries are adequate at best, it’s menu and button</w:t>
+      </w:r>
+      <w:r>
+        <w:t>s</w:t>
+      </w:r>
+      <w:r>
+        <w:t xml:space="preserve"> system</w:t>
+      </w:r>
+      <w:r>
+        <w:t>s</w:t>
+      </w:r>
+      <w:r>
+        <w:t xml:space="preserve"> </w:t>
+      </w:r>
+      <w:r>
+        <w:t>are</w:t>
+      </w:r>
+      <w:r>
+        <w:t xml:space="preserve"> unintuitive and clunky, and the options for lighting and graphical effects are limited. Furthermore, my own ability to create such systems from scratch is limited by Ursina too, with frustrating locational controls, difficulties with higher processing power requirements, and the failure of </w:t>
+      </w:r>
+      <w:r>
+        <w:t>its</w:t>
+      </w:r>
+      <w:r>
+        <w:t xml:space="preserve"> system to work within a multithreaded environment that ultimately limited my capabilities within the potential of the game. This resulted in the failure of me to adhere to my nonfunctional requirement of shading and lighting effects besides a simple texturing </w:t>
+      </w:r>
+      <w:r>
+        <w:t>change and</w:t>
+      </w:r>
+      <w:r>
+        <w:t xml:space="preserve"> ultimately caused </w:t>
+      </w:r>
+      <w:r>
+        <w:t xml:space="preserve">my project </w:t>
+      </w:r>
+      <w:r>
+        <w:t>to increase significantly in processing power requirements.</w:t>
+      </w:r>
+    </w:p>
+    <w:p>
+      <w:r>
+        <w:t>My second improvement would be to</w:t>
+      </w:r>
+      <w:r>
+        <w:t xml:space="preserve"> </w:t>
+      </w:r>
+      <w:r>
+        <w:t>lengthen the levels and provide a further set of skins and levels to ensure a more enjoyable experience within the game. Before settl</w:t>
+      </w:r>
+      <w:r>
+        <w:t>ing</w:t>
+      </w:r>
+      <w:r>
+        <w:t xml:space="preserve"> on the four main levels and mechanics, I had a</w:t>
+      </w:r>
+      <w:r>
+        <w:t xml:space="preserve"> large system of ideas derived from</w:t>
+      </w:r>
+      <w:r>
+        <w:t xml:space="preserve"> brainstorming that would have provided significantly more enjoyable content to the game</w:t>
+      </w:r>
+      <w:r>
+        <w:t xml:space="preserve"> (see appendix for brainstorming</w:t>
+      </w:r>
+      <w:r>
+        <w:t xml:space="preserve"> </w:t>
+      </w:r>
+      <w:r>
+        <w:t>ideas list</w:t>
+      </w:r>
+      <w:r>
+        <w:t>)</w:t>
+      </w:r>
+      <w:r>
+        <w:t>, however the presence of time constraints unfortunately resulted in a series of compromises that reduced the overall quality of the game. If these ideas had the time to develop and be implemented, I have no doubt that the game would display a significantly higher level of polish and player engagement.</w:t>
+      </w:r>
+      <w:r>
+        <w:t xml:space="preserve"> </w:t>
+      </w:r>
+    </w:p>
+    <w:p>
+      <w:pPr>
+        <w:pStyle w:val="Heading1"/>
+      </w:pPr>
+      <w:bookmarkStart w:id="37" w:name="_Toc202446600"/>
+      <w:r>
+        <w:t>Client Feedback and Reflection</w:t>
+      </w:r>
+      <w:bookmarkEnd w:id="37"/>
+    </w:p>
+    <w:p>
+      <w:pPr>
+        <w:pStyle w:val="Heading2"/>
+      </w:pPr>
+      <w:bookmarkStart w:id="38" w:name="_Toc202446601"/>
+      <w:r>
+        <w:t>Summary of Client Feedback</w:t>
+      </w:r>
+      <w:bookmarkEnd w:id="38"/>
+    </w:p>
+    <w:p>
+      <w:r>
+        <w:t>Client feedback followed a generally positive trend, providing important feedback based on components of the game I requested they test</w:t>
+      </w:r>
+      <w:r>
+        <w:t xml:space="preserve"> and stating a generally</w:t>
+      </w:r>
+      <w:r>
+        <w:t xml:space="preserve"> positive gameplay experience. Bugs were charted in a list of things to patch stored in a note file across computers and accessed during each update, with play testers’ advice and noted bugs being added separately to the list.</w:t>
+      </w:r>
+    </w:p>
+    <w:p>
+      <w:r>
+        <w:t>After the comple</w:t>
+      </w:r>
+      <w:r>
+        <w:t xml:space="preserve">tion of the game, client feedback was almost entirely positive, with the only heavily noted criticisms being that of depth perception issues and camera control issues. While Camera control was intentionally limited by the game to force a more logical thinking route, the depth perception issue was a significant issue that I attempted to remedy multiple times to no success. Attempting shader application resulted in extremely taxing processing requirement increases, with the only compromise being a reduction in quality to the point of complete ineffectiveness, providing interesting visual flair but ultimately doing little to improve player depth perception. The second remedy was retexturing the level models to use darker colours for lower components and shade sides differently from fronts. While this was helpful, the depth perception issues remained still. With extra time I likely could have remedied this issue through </w:t>
       </w:r>
       <w:r>
         <w:lastRenderedPageBreak/>
-        <w:t>itself had to be trimmed, cut or entirely scrapped as a result of the experienced limitations of time, knowledge, and choice of tools.</w:t>
-      </w:r>
-    </w:p>
-    <w:p>
-      <w:r>
-        <w:t xml:space="preserve">The most important component I would consider if I had the capability to take extra time and improve the game is to entirely scrap my usage of the Ursina engine. While it was helpful to apply my own capabilities in designing and building the game and </w:t>
+        <w:t xml:space="preserve">adaptive normal modelling in blender or working out the processing issues in the shader engine, however in </w:t>
       </w:r>
       <w:r>
         <w:t>its</w:t>
       </w:r>
       <w:r>
-        <w:t xml:space="preserve"> mechanics in the more familiar environment of python, Ursina itself is highly limiting and frankly terrible at </w:t>
+        <w:t xml:space="preserve"> current state it remains exceptionally playable.</w:t>
+      </w:r>
+    </w:p>
+    <w:p>
+      <w:r>
+        <w:t>The game’s visual and UI designs were foundationally dependent on user feedback</w:t>
+      </w:r>
+      <w:r>
+        <w:t>;</w:t>
+      </w:r>
+      <w:r>
+        <w:t xml:space="preserve"> gaining metric data through A/B and unit testing to ensure that player adaptability to the menu system was effective as possible. Retesting user metrics after production revealed that players were able to navigate menus easily, and with limited issue in finding important components and identifying locations to navigate to.</w:t>
+      </w:r>
+    </w:p>
+    <w:p>
+      <w:r>
+        <w:t xml:space="preserve">The gameplay of the levels </w:t>
+      </w:r>
+      <w:r>
+        <w:t>was</w:t>
+      </w:r>
+      <w:r>
+        <w:t xml:space="preserve"> found to be relatively effective in building player skill to provide a steep but fair learning curve to the game. The progression of object clutter, essential mechanics and required execution of complex movement was intended to slowly scale throughout the levels, allowing for a player progression of skill, and this was largely shown to be true among the final testers. </w:t>
+      </w:r>
+      <w:r>
+        <w:t xml:space="preserve">“Arghh, this one’s really hard… no, no one more try, I can do this.” </w:t>
+      </w:r>
+      <w:r>
+        <w:t>While some components were difficult for players to progress with, namely the middle part of Level 3 and the start of Level 1, the game overall offered a unique challenge that built player skill in a way that avoided internal frustration and ensured a functional player experience.</w:t>
+      </w:r>
+    </w:p>
+    <w:p>
+      <w:r>
+        <w:t xml:space="preserve">Audio and visual feedback was limited at </w:t>
+      </w:r>
+      <w:r>
+        <w:t>best but</w:t>
+      </w:r>
+      <w:r>
+        <w:t xml:space="preserve"> </w:t>
+      </w:r>
+      <w:r>
+        <w:t>remained</w:t>
+      </w:r>
+      <w:r>
+        <w:t xml:space="preserve"> valuable to gain information on. Multiple final testers returned that they had been ‘jumpscared’ by the death sound at the start, prompting me to lower the volume multiplier for the explosion sound effect, but otherwise criticism was largely joking, with a few complaints that the music was ‘shit’ contrasted by a variety of comparisons to 80s synthwave and sci-fi music theming, which was the exact sense I aimed to portray. Visual results were relatively positive too, with the only complaint being a lack of overall animation, namely in the player’s lateral movement. While this was considered early in development, I ultimately decided that an animation would need to be exceedingly subtle to not distract players while also maintaining instantaneous left and right movement, and with the apparent failure to apply proper graphical fidelity by Ursina’s renderer, I found that it would be more time, energy, and graphically efficient to avoid any further animations.</w:t>
+      </w:r>
+    </w:p>
+    <w:p>
+      <w:pPr>
+        <w:pStyle w:val="Heading2"/>
+      </w:pPr>
+      <w:bookmarkStart w:id="39" w:name="_Toc202446602"/>
+      <w:r>
+        <w:t>Personal Reflection</w:t>
+      </w:r>
+      <w:bookmarkEnd w:id="39"/>
+    </w:p>
+    <w:p>
+      <w:r>
+        <w:t xml:space="preserve">Leveraging my available time to improve the game in smaller, prototype style tests rather than constantly advancing a singular point with specific tasks was no doubt the most effective strategy. Prioritisation of required tasks from my determined lists of things to do accelerated my production process by a large margin as it allowed me to finish important features quickly and leave room for less effective designs or more painful problems to be considered over longer periods of time for their potential solutions and requirements. </w:t>
+      </w:r>
+    </w:p>
+    <w:p>
+      <w:r>
+        <w:t>While optimisations to workflow could certainly have been made, and my decision at the beginning to use the Ursina engine within python was certainly a costly mistake, I believe that the logical requirements of my development processes has resulted in a far better learning experience and a much more effective display of my capabilities than a conventional engine.</w:t>
+      </w:r>
+    </w:p>
+    <w:p>
+      <w:r>
+        <w:t xml:space="preserve">I’ve found that the game seems well-suited to my criteria, with limited player difficulties and a considerable amount of praise for </w:t>
       </w:r>
       <w:r>
         <w:t>its</w:t>
       </w:r>
       <w:r>
-        <w:t xml:space="preserve"> singular purpose of 3D rendering. </w:t>
-      </w:r>
-      <w:r>
-        <w:t>Its</w:t>
-      </w:r>
-      <w:r>
-        <w:t xml:space="preserve"> graphical libraries are adequate at best, it’s menu and button</w:t>
-      </w:r>
-      <w:r>
-        <w:t>s</w:t>
-      </w:r>
-      <w:r>
-        <w:t xml:space="preserve"> system</w:t>
-      </w:r>
-      <w:r>
-        <w:t>s</w:t>
-      </w:r>
-      <w:r>
-        <w:t xml:space="preserve"> </w:t>
-      </w:r>
-      <w:r>
-        <w:t>are</w:t>
-      </w:r>
-      <w:r>
-        <w:t xml:space="preserve"> unintuitive and clunky, and the options for lighting and graphical effects are limited. Furthermore, my own ability to create such systems from scratch is limited by Ursina too, with frustrating locational controls, difficulties with higher processing power requirements, and the failure of </w:t>
-      </w:r>
-      <w:r>
-        <w:t>its</w:t>
-      </w:r>
-      <w:r>
-        <w:t xml:space="preserve"> system to work within a multithreaded environment that ultimately limited my capabilities within the potential of the game. This resulted in the failure of me to adhere to my nonfunctional requirement of shading and lighting effects besides a simple texturing </w:t>
-      </w:r>
-      <w:r>
-        <w:t>change and</w:t>
-      </w:r>
-      <w:r>
-        <w:t xml:space="preserve"> ultimately caused </w:t>
-      </w:r>
-      <w:r>
-        <w:t xml:space="preserve">my project </w:t>
-      </w:r>
-      <w:r>
-        <w:t>to increase significantly in processing power requirements.</w:t>
-      </w:r>
-    </w:p>
-    <w:p>
-      <w:r>
-        <w:t>My second improvement would be to</w:t>
-      </w:r>
-      <w:r>
-        <w:t xml:space="preserve"> </w:t>
-      </w:r>
-      <w:r>
-        <w:t>lengthen the levels and provide a further set of skins and levels to ensure a more enjoyable experience within the game. Before settl</w:t>
-      </w:r>
-      <w:r>
-        <w:t>ing</w:t>
-      </w:r>
-      <w:r>
-        <w:t xml:space="preserve"> on the four main levels and mechanics, I had a</w:t>
-      </w:r>
-      <w:r>
-        <w:t xml:space="preserve"> large system of ideas derived from</w:t>
-      </w:r>
-      <w:r>
-        <w:t xml:space="preserve"> brainstorming that would have provided significantly more enjoyable content to the game</w:t>
-      </w:r>
-      <w:r>
-        <w:t xml:space="preserve"> (see appendix for brainstorming</w:t>
-      </w:r>
-      <w:r>
-        <w:t xml:space="preserve"> </w:t>
-      </w:r>
-      <w:r>
-        <w:t>ideas list</w:t>
-      </w:r>
-      <w:r>
-        <w:t>)</w:t>
-      </w:r>
-      <w:r>
-        <w:t>, however the presence of time constraints unfortunately resulted in a series of compromises that reduced the overall quality of the game. If these ideas had the time to develop and be implemented, I have no doubt that the game would display a significantly higher level of polish and player engagement.</w:t>
-      </w:r>
-      <w:r>
-        <w:t xml:space="preserve"> </w:t>
+        <w:t xml:space="preserve"> enjoyability. While I personally can still see areas for improvement, these areas were ultimately gated by significant time sinks or entirely limited by the engine itself. I have no doubt I will continue to work on this game in my own time to polish more and provide more available features to players, however I find the game to be in an acceptable and complete state for submission at the time of writing, and I believe (and hope) that the play testers would feel the same.</w:t>
       </w:r>
     </w:p>
     <w:p>
       <w:pPr>
         <w:pStyle w:val="Heading1"/>
       </w:pPr>
-      <w:bookmarkStart w:id="37" w:name="_Toc202446600"/>
-      <w:r>
-        <w:t>Client Feedback and Reflection</w:t>
-      </w:r>
-      <w:bookmarkEnd w:id="37"/>
-    </w:p>
-    <w:p>
-      <w:pPr>
-        <w:pStyle w:val="Heading2"/>
-      </w:pPr>
-      <w:bookmarkStart w:id="38" w:name="_Toc202446601"/>
-      <w:r>
-        <w:t>Summary of Client Feedback</w:t>
-      </w:r>
-      <w:bookmarkEnd w:id="38"/>
-    </w:p>
-    <w:p>
-      <w:r>
-        <w:t>Client feedback followed a generally positive trend, providing important feedback based on components of the game I requested they test</w:t>
-      </w:r>
-      <w:r>
-        <w:t xml:space="preserve"> and stating a generally</w:t>
-      </w:r>
-      <w:r>
-        <w:t xml:space="preserve"> positive gameplay experience. Bugs were charted in a list of things to patch stored in a note file across computers and accessed during each update, with play testers’ advice and noted bugs being added separately to the list.</w:t>
-      </w:r>
-    </w:p>
-    <w:p>
-      <w:r>
-        <w:t>After the comple</w:t>
-      </w:r>
-      <w:r>
-        <w:t xml:space="preserve">tion of the game, client feedback was almost entirely positive, with the only heavily noted criticisms being that of depth perception issues and camera control issues. While Camera control was intentionally limited by the game to force a more logical thinking route, the depth perception issue was a significant issue that I attempted to remedy multiple times to no success. Attempting shader application resulted in extremely taxing processing requirement increases, with the only compromise being a reduction in quality to the point of complete ineffectiveness, providing interesting visual flair but ultimately doing little to improve player depth perception. The second remedy was retexturing the level models to use darker colours for lower components and shade sides differently from fronts. While this was helpful, the depth perception issues remained still. With extra time I likely could have remedied this issue through adaptive normal modelling in blender or working out the processing issues in the shader engine, however in </w:t>
-      </w:r>
-      <w:r>
-        <w:t>its</w:t>
-      </w:r>
-      <w:r>
-        <w:t xml:space="preserve"> current state it remains exceptionally playable.</w:t>
-      </w:r>
-    </w:p>
-    <w:p>
+      <w:bookmarkStart w:id="40" w:name="_Toc202446603"/>
       <w:r>
         <w:lastRenderedPageBreak/>
-        <w:t>The game’s visual and UI designs were foundationally dependent on user feedback</w:t>
-      </w:r>
-      <w:r>
-        <w:t>;</w:t>
-      </w:r>
-      <w:r>
-        <w:t xml:space="preserve"> gaining metric data through A/B and unit testing to ensure that player adaptability to the menu system was effective as possible. Retesting user metrics after production revealed that players were able to navigate menus easily, and with limited issue in finding important components and identifying locations to navigate to.</w:t>
-      </w:r>
-    </w:p>
-    <w:p>
-      <w:r>
-        <w:t xml:space="preserve">The gameplay of the levels </w:t>
-      </w:r>
-      <w:r>
-        <w:t>was</w:t>
-      </w:r>
-      <w:r>
-        <w:t xml:space="preserve"> found to be relatively effective in building player skill to provide a steep but fair learning curve to the game. The progression of object clutter, essential mechanics and required execution of complex movement was intended to slowly scale throughout the levels, allowing for a player progression of skill, and this was largely shown to be true among the final testers. </w:t>
-      </w:r>
-      <w:r>
-        <w:t xml:space="preserve">“Arghh, this one’s really hard… no, no one more try, I can do this.” </w:t>
-      </w:r>
-      <w:r>
-        <w:t>While some components were difficult for players to progress with, namely the middle part of Level 3 and the start of Level 1, the game overall offered a unique challenge that built player skill in a way that avoided internal frustration and ensured a functional player experience.</w:t>
-      </w:r>
-    </w:p>
-    <w:p>
-      <w:r>
-        <w:t xml:space="preserve">Audio and visual feedback was limited at </w:t>
-      </w:r>
-      <w:r>
-        <w:t>best but</w:t>
-      </w:r>
-      <w:r>
-        <w:t xml:space="preserve"> </w:t>
-      </w:r>
-      <w:r>
-        <w:t>remained</w:t>
-      </w:r>
-      <w:r>
-        <w:t xml:space="preserve"> valuable to gain information on. Multiple final testers returned that they had been ‘jumpscared’ by the death sound at the start, prompting me to lower the volume multiplier for the explosion sound effect, but otherwise criticism was largely joking, with a few complaints that the music was ‘shit’ contrasted by a variety of comparisons to 80s synthwave and sci-fi music theming, which was the exact sense I aimed to portray. Visual results were relatively positive too, with the only complaint being a lack of overall animation, namely in the player’s lateral movement. While this was considered early in development, I ultimately decided that an animation would need to be exceedingly subtle to not distract players while also maintaining instantaneous left and right movement, and with the apparent failure to apply proper graphical fidelity by Ursina’s renderer, I found that it would be more time, energy, and graphically efficient to avoid any further animations.</w:t>
-      </w:r>
-    </w:p>
-    <w:p>
-      <w:pPr>
-        <w:pStyle w:val="Heading2"/>
-      </w:pPr>
-      <w:bookmarkStart w:id="39" w:name="_Toc202446602"/>
-      <w:r>
-        <w:t>Personal Reflection</w:t>
-      </w:r>
-      <w:bookmarkEnd w:id="39"/>
-    </w:p>
-    <w:p>
-      <w:r>
-        <w:t xml:space="preserve">Leveraging my available time to improve the game in smaller, prototype style tests rather than constantly advancing a singular point with specific tasks was no doubt the most effective strategy. Prioritisation of required tasks from my determined lists of things to do accelerated my production process by a large margin as it allowed me to finish important features quickly and leave room for less effective designs or more painful problems to be considered over longer periods of time for their potential solutions and requirements. </w:t>
-      </w:r>
-    </w:p>
-    <w:p>
-      <w:r>
-        <w:t>While optimisations to workflow could certainly have been made, and my decision at the beginning to use the Ursina engine within python was certainly a costly mistake, I believe that the logical requirements of my development processes has resulted in a far better learning experience and a much more effective display of my capabilities than a conventional engine.</w:t>
-      </w:r>
-    </w:p>
-    <w:p>
-      <w:r>
-        <w:t xml:space="preserve">I’ve found that the game seems well-suited to my criteria, with limited player difficulties and a considerable amount of praise for </w:t>
-      </w:r>
-      <w:r>
-        <w:t>its</w:t>
-      </w:r>
-      <w:r>
-        <w:t xml:space="preserve"> enjoyability. While I personally can still see areas for improvement, these areas were ultimately gated by significant time sinks or entirely limited by the engine itself. I have no doubt I will continue to work on this game in my own time to polish more and provide more available features to players, however I find the game to be in an acceptable and complete state for submission at the time of writing, and I believe (and hope) that the play testers would feel the same.</w:t>
-      </w:r>
-    </w:p>
-    <w:p/>
-    <w:p/>
-    <w:p/>
-    <w:p/>
-    <w:p/>
-    <w:p/>
-    <w:p>
-      <w:pPr>
-        <w:pStyle w:val="Heading1"/>
-      </w:pPr>
-      <w:bookmarkStart w:id="40" w:name="_Toc202446603"/>
-      <w:r>
         <w:t>Appendix</w:t>
       </w:r>
       <w:bookmarkEnd w:id="40"/>
@@ -10047,7 +10070,6 @@
         </w:numPr>
       </w:pPr>
       <w:r>
-        <w:lastRenderedPageBreak/>
         <w:t>Camera orients to have player as front and centre and mouse movements control y and z position?</w:t>
       </w:r>
     </w:p>
@@ -10144,6 +10166,7 @@
         </w:numPr>
       </w:pPr>
       <w:r>
+        <w:lastRenderedPageBreak/>
         <w:t>Potential gamemode where map has complete darkness and landing a jump provides a brief light flash?</w:t>
       </w:r>
     </w:p>
@@ -11075,7 +11098,6 @@
   <w:style w:type="character" w:default="1" w:styleId="DefaultParagraphFont">
     <w:name w:val="Default Paragraph Font"/>
     <w:uiPriority w:val="1"/>
-    <w:semiHidden/>
     <w:unhideWhenUsed/>
   </w:style>
   <w:style w:type="table" w:default="1" w:styleId="TableNormal">

</xml_diff>